<commit_message>
inclusão de novo artigo sobre stalking bancário voltado para a pessoa fisica
</commit_message>
<xml_diff>
--- a/documentos/08 03 2026 S3 Artigo 5 O Banco é Responsável.docx
+++ b/documentos/08 03 2026 S3 Artigo 5 O Banco é Responsável.docx
@@ -45,7 +45,7 @@
     <w:p>
       <w:r>
         <w:pict w14:anchorId="041FEE97">
-          <v:rect id="_x0000_i1097" style="width:0;height:1.5pt" o:hralign="center" o:hrstd="t" o:hrnoshade="t" o:hr="t" fillcolor="gray" stroked="f"/>
+          <v:rect id="_x0000_i1025" style="width:0;height:1.5pt" o:hralign="center" o:hrstd="t" o:hrnoshade="t" o:hr="t" fillcolor="gray" stroked="f"/>
         </w:pict>
       </w:r>
     </w:p>
@@ -124,15 +124,7 @@
         <w:t>:</w:t>
       </w:r>
       <w:r>
-        <w:t xml:space="preserve"> O banco é responsável pelo </w:t>
-      </w:r>
-      <w:proofErr w:type="spellStart"/>
-      <w:r>
-        <w:t>stalking</w:t>
-      </w:r>
-      <w:proofErr w:type="spellEnd"/>
-      <w:r>
-        <w:t xml:space="preserve"> das assessorias de cobrança? Entenda a solidariedade jurídica e como a perícia prova a cultura institucional do abuso.</w:t>
+        <w:t xml:space="preserve"> O banco é responsável pelo stalking das assessorias de cobrança? Entenda a solidariedade jurídica e como a perícia prova a cultura institucional do abuso.</w:t>
       </w:r>
     </w:p>
     <w:p>
@@ -174,7 +166,7 @@
     <w:p>
       <w:r>
         <w:pict w14:anchorId="5810C4DC">
-          <v:rect id="_x0000_i1098" style="width:0;height:1.5pt" o:hralign="center" o:hrstd="t" o:hrnoshade="t" o:hr="t" fillcolor="gray" stroked="f"/>
+          <v:rect id="_x0000_i1026" style="width:0;height:1.5pt" o:hralign="center" o:hrstd="t" o:hrnoshade="t" o:hr="t" fillcolor="gray" stroked="f"/>
         </w:pict>
       </w:r>
     </w:p>
@@ -246,7 +238,7 @@
     <w:p>
       <w:r>
         <w:pict w14:anchorId="165D19FF">
-          <v:rect id="_x0000_i1099" style="width:0;height:1.5pt" o:hralign="center" o:hrstd="t" o:hrnoshade="t" o:hr="t" fillcolor="gray" stroked="f"/>
+          <v:rect id="_x0000_i1027" style="width:0;height:1.5pt" o:hralign="center" o:hrstd="t" o:hrnoshade="t" o:hr="t" fillcolor="gray" stroked="f"/>
         </w:pict>
       </w:r>
     </w:p>
@@ -317,7 +309,7 @@
     <w:p>
       <w:r>
         <w:pict w14:anchorId="0CBAF899">
-          <v:rect id="_x0000_i1100" style="width:0;height:1.5pt" o:hralign="center" o:hrstd="t" o:hrnoshade="t" o:hr="t" fillcolor="gray" stroked="f"/>
+          <v:rect id="_x0000_i1028" style="width:0;height:1.5pt" o:hralign="center" o:hrstd="t" o:hrnoshade="t" o:hr="t" fillcolor="gray" stroked="f"/>
         </w:pict>
       </w:r>
     </w:p>
@@ -372,7 +364,7 @@
     <w:p>
       <w:r>
         <w:pict w14:anchorId="7BDFB874">
-          <v:rect id="_x0000_i1101" style="width:0;height:1.5pt" o:hralign="center" o:hrstd="t" o:hrnoshade="t" o:hr="t" fillcolor="gray" stroked="f"/>
+          <v:rect id="_x0000_i1029" style="width:0;height:1.5pt" o:hralign="center" o:hrstd="t" o:hrnoshade="t" o:hr="t" fillcolor="gray" stroked="f"/>
         </w:pict>
       </w:r>
     </w:p>
@@ -422,7 +414,7 @@
     <w:p>
       <w:r>
         <w:pict w14:anchorId="50B44728">
-          <v:rect id="_x0000_i1102" style="width:0;height:1.5pt" o:hralign="center" o:hrstd="t" o:hrnoshade="t" o:hr="t" fillcolor="gray" stroked="f"/>
+          <v:rect id="_x0000_i1030" style="width:0;height:1.5pt" o:hralign="center" o:hrstd="t" o:hrnoshade="t" o:hr="t" fillcolor="gray" stroked="f"/>
         </w:pict>
       </w:r>
     </w:p>
@@ -923,7 +915,7 @@
     <w:p>
       <w:r>
         <w:pict w14:anchorId="2F1A9DAD">
-          <v:rect id="_x0000_i1103" style="width:0;height:1.5pt" o:hralign="center" o:hrstd="t" o:hrnoshade="t" o:hr="t" fillcolor="gray" stroked="f"/>
+          <v:rect id="_x0000_i1031" style="width:0;height:1.5pt" o:hralign="center" o:hrstd="t" o:hrnoshade="t" o:hr="t" fillcolor="gray" stroked="f"/>
         </w:pict>
       </w:r>
     </w:p>
@@ -970,7 +962,7 @@
     <w:p>
       <w:r>
         <w:pict w14:anchorId="2B1FCF04">
-          <v:rect id="_x0000_i1104" style="width:0;height:1.5pt" o:hralign="center" o:hrstd="t" o:hrnoshade="t" o:hr="t" fillcolor="gray" stroked="f"/>
+          <v:rect id="_x0000_i1032" style="width:0;height:1.5pt" o:hralign="center" o:hrstd="t" o:hrnoshade="t" o:hr="t" fillcolor="gray" stroked="f"/>
         </w:pict>
       </w:r>
     </w:p>
@@ -1061,7 +1053,7 @@
     <w:p>
       <w:r>
         <w:pict w14:anchorId="7E5585C5">
-          <v:rect id="_x0000_i1105" style="width:0;height:1.5pt" o:hralign="center" o:hrstd="t" o:hrnoshade="t" o:hr="t" fillcolor="gray" stroked="f"/>
+          <v:rect id="_x0000_i1033" style="width:0;height:1.5pt" o:hralign="center" o:hrstd="t" o:hrnoshade="t" o:hr="t" fillcolor="gray" stroked="f"/>
         </w:pict>
       </w:r>
     </w:p>
@@ -1113,7 +1105,7 @@
     <w:p>
       <w:r>
         <w:pict w14:anchorId="31F9D50C">
-          <v:rect id="_x0000_i1106" style="width:0;height:1.5pt" o:hralign="center" o:hrstd="t" o:hrnoshade="t" o:hr="t" fillcolor="gray" stroked="f"/>
+          <v:rect id="_x0000_i1034" style="width:0;height:1.5pt" o:hralign="center" o:hrstd="t" o:hrnoshade="t" o:hr="t" fillcolor="gray" stroked="f"/>
         </w:pict>
       </w:r>
     </w:p>
@@ -1168,7 +1160,7 @@
     <w:p>
       <w:r>
         <w:pict w14:anchorId="586EF836">
-          <v:rect id="_x0000_i1107" style="width:0;height:1.5pt" o:hralign="center" o:hrstd="t" o:hrnoshade="t" o:hr="t" fillcolor="gray" stroked="f"/>
+          <v:rect id="_x0000_i1035" style="width:0;height:1.5pt" o:hralign="center" o:hrstd="t" o:hrnoshade="t" o:hr="t" fillcolor="gray" stroked="f"/>
         </w:pict>
       </w:r>
     </w:p>
@@ -1231,7 +1223,7 @@
     <w:p>
       <w:r>
         <w:pict w14:anchorId="34351B11">
-          <v:rect id="_x0000_i1108" style="width:0;height:1.5pt" o:hralign="center" o:hrstd="t" o:hrnoshade="t" o:hr="t" fillcolor="gray" stroked="f"/>
+          <v:rect id="_x0000_i1036" style="width:0;height:1.5pt" o:hralign="center" o:hrstd="t" o:hrnoshade="t" o:hr="t" fillcolor="gray" stroked="f"/>
         </w:pict>
       </w:r>
     </w:p>
@@ -2548,6 +2540,7 @@
   <w:style w:type="character" w:default="1" w:styleId="Fontepargpadro">
     <w:name w:val="Default Paragraph Font"/>
     <w:uiPriority w:val="1"/>
+    <w:semiHidden/>
     <w:unhideWhenUsed/>
   </w:style>
   <w:style w:type="table" w:default="1" w:styleId="Tabelanormal">

</xml_diff>